<commit_message>
Add Chapter 5 limitations section (FA/EN); flag stale EN numbers
New 5-4 (Limitations of the study) in both languages, future-work
renumbered to 5-5: linear-elastic/no-failure model, temperature-
independent properties, isotropic composite homogenization, ideal
layer bonding, qualitative-only wave validation, selected porosity
patterns, geometric/loading scope. Docx regenerated via pandoc.

While editing, found CHAPTER5_conclusions_EN.md still carries stale
pre-R4.4 numbers in its findings despite REVISIONS.md claiming it was
refreshed. Logged as DECISIONS_NEEDED item 10, not fixed here.
</commit_message>
<xml_diff>
--- a/claude/thesis_chapter/CHAPTER5_conclusions_EN.docx
+++ b/claude/thesis_chapter/CHAPTER5_conclusions_EN.docx
@@ -2,7 +2,7 @@
 <file path=word/document.xml><?xml version="1.0" encoding="utf-8"?>
 <w:document xmlns:w="http://schemas.openxmlformats.org/wordprocessingml/2006/main" xmlns:m="http://schemas.openxmlformats.org/officeDocument/2006/math" xmlns:r="http://schemas.openxmlformats.org/officeDocument/2006/relationships" xmlns:o="urn:schemas-microsoft-com:office:office" xmlns:v="urn:schemas-microsoft-com:vml" xmlns:w10="urn:schemas-microsoft-com:office:word" xmlns:a="http://schemas.openxmlformats.org/drawingml/2006/main" xmlns:pic="http://schemas.openxmlformats.org/drawingml/2006/picture" xmlns:wp="http://schemas.openxmlformats.org/drawingml/2006/wordprocessingDrawing">
   <w:body>
-    <w:bookmarkStart w:id="13" w:name="Xf0557c5cfe34de874c2f8e72d301619dda0a38a"/>
+    <w:bookmarkStart w:id="14" w:name="Xf0557c5cfe34de874c2f8e72d301619dda0a38a"/>
     <w:p>
       <w:pPr>
         <w:pStyle w:val="Heading1"/>
@@ -814,13 +814,33 @@
       </w:r>
     </w:p>
     <w:bookmarkEnd w:id="11"/>
-    <w:bookmarkStart w:id="12" w:name="recommendations-for-future-work"/>
+    <w:bookmarkStart w:id="12" w:name="limitations-of-the-study"/>
     <w:p>
       <w:pPr>
         <w:pStyle w:val="Heading2"/>
       </w:pPr>
       <w:r>
-        <w:t xml:space="preserve">5-4. Recommendations for future work</w:t>
+        <w:t xml:space="preserve">5-4. Limitations of the study</w:t>
+      </w:r>
+    </w:p>
+    <w:p>
+      <w:pPr>
+        <w:pStyle w:val="FirstParagraph"/>
+      </w:pPr>
+      <w:r>
+        <w:t xml:space="preserve">As with any numerical study, this work was carried out within a specific set of</w:t>
+      </w:r>
+      <w:r>
+        <w:t xml:space="preserve"> </w:t>
+      </w:r>
+      <w:r>
+        <w:t xml:space="preserve">assumptions and boundaries that should be kept in mind when interpreting or</w:t>
+      </w:r>
+      <w:r>
+        <w:t xml:space="preserve"> </w:t>
+      </w:r>
+      <w:r>
+        <w:t xml:space="preserve">generalizing the results:</w:t>
       </w:r>
     </w:p>
     <w:p>
@@ -836,25 +856,49 @@
           <w:b/>
           <w:bCs/>
         </w:rPr>
-        <w:t xml:space="preserve">Free/roller (F/R) supports:</w:t>
-      </w:r>
-      <w:r>
-        <w:t xml:space="preserve"> </w:t>
-      </w:r>
-      <w:r>
-        <w:t xml:space="preserve">a stable implementation of these supports and</w:t>
-      </w:r>
-      <w:r>
-        <w:t xml:space="preserve"> </w:t>
-      </w:r>
-      <w:r>
-        <w:t xml:space="preserve">the addition of a true plane-strain reference for a direct comparison with</w:t>
-      </w:r>
-      <w:r>
-        <w:t xml:space="preserve"> </w:t>
-      </w:r>
-      <w:r>
-        <w:t xml:space="preserve">the infinite-length limit.</w:t>
+        <w:t xml:space="preserve">Linear elastic model, no damage/failure criterion.</w:t>
+      </w:r>
+      <w:r>
+        <w:t xml:space="preserve"> </w:t>
+      </w:r>
+      <w:r>
+        <w:t xml:space="preserve">Stresses and</w:t>
+      </w:r>
+      <w:r>
+        <w:t xml:space="preserve"> </w:t>
+      </w:r>
+      <w:r>
+        <w:t xml:space="preserve">displacements throughout this work — including under large loads such as a</w:t>
+      </w:r>
+      <w:r>
+        <w:t xml:space="preserve"> </w:t>
+      </w:r>
+      <w:r>
+        <w:t xml:space="preserve">100 MPa internal pressure or an impulsive thermal shock — are reported under</w:t>
+      </w:r>
+      <w:r>
+        <w:t xml:space="preserve"> </w:t>
+      </w:r>
+      <w:r>
+        <w:t xml:space="preserve">the linear-elasticity assumption. The model has no yield, cracking, or</w:t>
+      </w:r>
+      <w:r>
+        <w:t xml:space="preserve"> </w:t>
+      </w:r>
+      <w:r>
+        <w:t xml:space="preserve">interlayer-separation criterion; under very large loads, the results should</w:t>
+      </w:r>
+      <w:r>
+        <w:t xml:space="preserve"> </w:t>
+      </w:r>
+      <w:r>
+        <w:t xml:space="preserve">therefore be read as the mathematical extrapolation of a linear model, not a</w:t>
+      </w:r>
+      <w:r>
+        <w:t xml:space="preserve"> </w:t>
+      </w:r>
+      <w:r>
+        <w:t xml:space="preserve">prediction of actual material failure.</w:t>
       </w:r>
     </w:p>
     <w:p>
@@ -870,19 +914,37 @@
           <w:b/>
           <w:bCs/>
         </w:rPr>
-        <w:t xml:space="preserve">Vectorized assembly:</w:t>
-      </w:r>
-      <w:r>
-        <w:t xml:space="preserve"> </w:t>
-      </w:r>
-      <w:r>
-        <w:t xml:space="preserve">rewriting the assembly loop in vectorized form to</w:t>
-      </w:r>
-      <w:r>
-        <w:t xml:space="preserve"> </w:t>
-      </w:r>
-      <w:r>
-        <w:t xml:space="preserve">reduce the computation time for larger grids and broader parametric studies.</w:t>
+        <w:t xml:space="preserve">Temperature-independent material properties.</w:t>
+      </w:r>
+      <w:r>
+        <w:t xml:space="preserve"> </w:t>
+      </w:r>
+      <w:r>
+        <w:t xml:space="preserve">Young’s modulus, thermal</w:t>
+      </w:r>
+      <w:r>
+        <w:t xml:space="preserve"> </w:t>
+      </w:r>
+      <w:r>
+        <w:t xml:space="preserve">conductivity, the thermal expansion coefficient, and specific heat are held</w:t>
+      </w:r>
+      <w:r>
+        <w:t xml:space="preserve"> </w:t>
+      </w:r>
+      <w:r>
+        <w:t xml:space="preserve">constant throughout the solution, while the reference loading takes the</w:t>
+      </w:r>
+      <w:r>
+        <w:t xml:space="preserve"> </w:t>
+      </w:r>
+      <w:r>
+        <w:t xml:space="preserve">inner-surface temperature from 300 to 600 K; over this range, the real</w:t>
+      </w:r>
+      <w:r>
+        <w:t xml:space="preserve"> </w:t>
+      </w:r>
+      <w:r>
+        <w:t xml:space="preserve">temperature-dependence of the material properties is not negligible.</w:t>
       </w:r>
     </w:p>
     <w:p>
@@ -898,25 +960,120 @@
           <w:b/>
           <w:bCs/>
         </w:rPr>
-        <w:t xml:space="preserve">Temperature-dependent material properties:</w:t>
-      </w:r>
-      <w:r>
-        <w:t xml:space="preserve"> </w:t>
-      </w:r>
-      <w:r>
-        <w:t xml:space="preserve">including the dependence of the</w:t>
-      </w:r>
-      <w:r>
-        <w:t xml:space="preserve"> </w:t>
-      </w:r>
-      <w:r>
-        <w:t xml:space="preserve">modulus, conductivity and expansion coefficient on temperature, which is</w:t>
-      </w:r>
-      <w:r>
-        <w:t xml:space="preserve"> </w:t>
-      </w:r>
-      <w:r>
-        <w:t xml:space="preserve">significant over the 300–600 K range.</w:t>
+        <w:t xml:space="preserve">Isotropic homogenization of the composite layer.</w:t>
+      </w:r>
+      <w:r>
+        <w:t xml:space="preserve"> </w:t>
+      </w:r>
+      <w:r>
+        <w:t xml:space="preserve">The elastic matrix of the</w:t>
+      </w:r>
+      <w:r>
+        <w:t xml:space="preserve"> </w:t>
+      </w:r>
+      <w:r>
+        <w:t xml:space="preserve">GPL-matrix layer is reduced to a single effective isotropic modulus via the</w:t>
+      </w:r>
+      <w:r>
+        <w:t xml:space="preserve"> </w:t>
+      </w:r>
+      <w:r>
+        <w:t xml:space="preserve">Halpin-Tsai average (</w:t>
+      </w:r>
+      <m:oMath>
+        <m:sSub>
+          <m:e>
+            <m:r>
+              <m:t>E</m:t>
+            </m:r>
+          </m:e>
+          <m:sub>
+            <m:r>
+              <m:t>s</m:t>
+            </m:r>
+          </m:sub>
+        </m:sSub>
+        <m:r>
+          <m:rPr>
+            <m:sty m:val="p"/>
+          </m:rPr>
+          <m:t>=</m:t>
+        </m:r>
+        <m:f>
+          <m:fPr>
+            <m:type m:val="lin"/>
+          </m:fPr>
+          <m:num>
+            <m:r>
+              <m:t>3</m:t>
+            </m:r>
+          </m:num>
+          <m:den>
+            <m:r>
+              <m:t>8</m:t>
+            </m:r>
+          </m:den>
+        </m:f>
+        <m:sSub>
+          <m:e>
+            <m:r>
+              <m:t>E</m:t>
+            </m:r>
+          </m:e>
+          <m:sub>
+            <m:r>
+              <m:t>L</m:t>
+            </m:r>
+          </m:sub>
+        </m:sSub>
+        <m:r>
+          <m:rPr>
+            <m:sty m:val="p"/>
+          </m:rPr>
+          <m:t>+</m:t>
+        </m:r>
+        <m:f>
+          <m:fPr>
+            <m:type m:val="lin"/>
+          </m:fPr>
+          <m:num>
+            <m:r>
+              <m:t>5</m:t>
+            </m:r>
+          </m:num>
+          <m:den>
+            <m:r>
+              <m:t>8</m:t>
+            </m:r>
+          </m:den>
+        </m:f>
+        <m:sSub>
+          <m:e>
+            <m:r>
+              <m:t>E</m:t>
+            </m:r>
+          </m:e>
+          <m:sub>
+            <m:r>
+              <m:t>T</m:t>
+            </m:r>
+          </m:sub>
+        </m:sSub>
+      </m:oMath>
+      <w:r>
+        <w:t xml:space="preserve">); a real nanocomposite</w:t>
+      </w:r>
+      <w:r>
+        <w:t xml:space="preserve"> </w:t>
+      </w:r>
+      <w:r>
+        <w:t xml:space="preserve">sheet is inherently transversely isotropic, and this simplification can shift</w:t>
+      </w:r>
+      <w:r>
+        <w:t xml:space="preserve"> </w:t>
+      </w:r>
+      <w:r>
+        <w:t xml:space="preserve">the axial response somewhat.</w:t>
       </w:r>
     </w:p>
     <w:p>
@@ -932,19 +1089,31 @@
           <w:b/>
           <w:bCs/>
         </w:rPr>
-        <w:t xml:space="preserve">Radiation boundary condition:</w:t>
-      </w:r>
-      <w:r>
-        <w:t xml:space="preserve"> </w:t>
-      </w:r>
-      <w:r>
-        <w:t xml:space="preserve">adding nonlinear radiative heat exchange at</w:t>
-      </w:r>
-      <w:r>
-        <w:t xml:space="preserve"> </w:t>
-      </w:r>
-      <w:r>
-        <w:t xml:space="preserve">the outer surface for high-temperature applications.</w:t>
+        <w:t xml:space="preserve">Ideal layer-to-layer bonding.</w:t>
+      </w:r>
+      <w:r>
+        <w:t xml:space="preserve"> </w:t>
+      </w:r>
+      <w:r>
+        <w:t xml:space="preserve">Interfaces between layers enforce full</w:t>
+      </w:r>
+      <w:r>
+        <w:t xml:space="preserve"> </w:t>
+      </w:r>
+      <w:r>
+        <w:t xml:space="preserve">continuity of temperature, flux, displacement, and traction; the thermal and</w:t>
+      </w:r>
+      <w:r>
+        <w:t xml:space="preserve"> </w:t>
+      </w:r>
+      <w:r>
+        <w:t xml:space="preserve">mechanical contact resistance that is always present in a real layered</w:t>
+      </w:r>
+      <w:r>
+        <w:t xml:space="preserve"> </w:t>
+      </w:r>
+      <w:r>
+        <w:t xml:space="preserve">structure is not included in the model.</w:t>
       </w:r>
     </w:p>
     <w:p>
@@ -960,31 +1129,31 @@
           <w:b/>
           <w:bCs/>
         </w:rPr>
-        <w:t xml:space="preserve">Damage/failure model:</w:t>
-      </w:r>
-      <w:r>
-        <w:t xml:space="preserve"> </w:t>
-      </w:r>
-      <w:r>
-        <w:t xml:space="preserve">since the present linear thermoelastic model shows</w:t>
-      </w:r>
-      <w:r>
-        <w:t xml:space="preserve"> </w:t>
-      </w:r>
-      <w:r>
-        <w:t xml:space="preserve">no discontinuity even at 100 MPa, adding a damage or failure model is</w:t>
-      </w:r>
-      <w:r>
-        <w:t xml:space="preserve"> </w:t>
-      </w:r>
-      <w:r>
-        <w:t xml:space="preserve">necessary to predict rupture (material failure/separation) under very high</w:t>
-      </w:r>
-      <w:r>
-        <w:t xml:space="preserve"> </w:t>
-      </w:r>
-      <w:r>
-        <w:t xml:space="preserve">loads.</w:t>
+        <w:t xml:space="preserve">Qualitative validation of the wave-propagation core.</w:t>
+      </w:r>
+      <w:r>
+        <w:t xml:space="preserve"> </w:t>
+      </w:r>
+      <w:r>
+        <w:t xml:space="preserve">The central claim of</w:t>
+      </w:r>
+      <w:r>
+        <w:t xml:space="preserve"> </w:t>
+      </w:r>
+      <w:r>
+        <w:t xml:space="preserve">this work — the second-sound wave overshoot — is validated only qualitatively</w:t>
+      </w:r>
+      <w:r>
+        <w:t xml:space="preserve"> </w:t>
+      </w:r>
+      <w:r>
+        <w:t xml:space="preserve">(matching the trend of speed and reflection) against the Bagri and Eslami</w:t>
+      </w:r>
+      <w:r>
+        <w:t xml:space="preserve"> </w:t>
+      </w:r>
+      <w:r>
+        <w:t xml:space="preserve">results; no quantitative error metric is reported for this specific test.</w:t>
       </w:r>
     </w:p>
     <w:p>
@@ -1000,25 +1169,31 @@
           <w:b/>
           <w:bCs/>
         </w:rPr>
-        <w:t xml:space="preserve">Updated porosity patterns:</w:t>
-      </w:r>
-      <w:r>
-        <w:t xml:space="preserve"> </w:t>
-      </w:r>
-      <w:r>
-        <w:t xml:space="preserve">replacing the porosity patterns with the new</w:t>
-      </w:r>
-      <w:r>
-        <w:t xml:space="preserve"> </w:t>
-      </w:r>
-      <w:r>
-        <w:t xml:space="preserve">patterns of the reference file and re-running the porosity and interaction</w:t>
-      </w:r>
-      <w:r>
-        <w:t xml:space="preserve"> </w:t>
-      </w:r>
-      <w:r>
-        <w:t xml:space="preserve">studies.</w:t>
+        <w:t xml:space="preserve">Selected porosity patterns.</w:t>
+      </w:r>
+      <w:r>
+        <w:t xml:space="preserve"> </w:t>
+      </w:r>
+      <w:r>
+        <w:t xml:space="preserve">The porosity patterns used (UD, O, X, V, A)</w:t>
+      </w:r>
+      <w:r>
+        <w:t xml:space="preserve"> </w:t>
+      </w:r>
+      <w:r>
+        <w:t xml:space="preserve">were chosen based on the standard open-cell metal-foam model; this is a</w:t>
+      </w:r>
+      <w:r>
+        <w:t xml:space="preserve"> </w:t>
+      </w:r>
+      <w:r>
+        <w:t xml:space="preserve">deliberate modeling choice, not a complete representation of every possible</w:t>
+      </w:r>
+      <w:r>
+        <w:t xml:space="preserve"> </w:t>
+      </w:r>
+      <w:r>
+        <w:t xml:space="preserve">porous microstructure.</w:t>
       </w:r>
     </w:p>
     <w:p>
@@ -1034,6 +1209,254 @@
           <w:b/>
           <w:bCs/>
         </w:rPr>
+        <w:t xml:space="preserve">Geometric and loading scope.</w:t>
+      </w:r>
+      <w:r>
+        <w:t xml:space="preserve"> </w:t>
+      </w:r>
+      <w:r>
+        <w:t xml:space="preserve">The study is limited to a straight cylindrical</w:t>
+      </w:r>
+      <w:r>
+        <w:t xml:space="preserve"> </w:t>
+      </w:r>
+      <w:r>
+        <w:t xml:space="preserve">shell with simple/clamped/mixed supports and axisymmetric thermo-mechanical</w:t>
+      </w:r>
+      <w:r>
+        <w:t xml:space="preserve"> </w:t>
+      </w:r>
+      <w:r>
+        <w:t xml:space="preserve">loading; conical or rotating geometries, non-axisymmetric loading, and fully</w:t>
+      </w:r>
+      <w:r>
+        <w:t xml:space="preserve"> </w:t>
+      </w:r>
+      <w:r>
+        <w:t xml:space="preserve">three-dimensional effects lie outside the scope of this work.</w:t>
+      </w:r>
+    </w:p>
+    <w:bookmarkEnd w:id="12"/>
+    <w:bookmarkStart w:id="13" w:name="recommendations-for-future-work"/>
+    <w:p>
+      <w:pPr>
+        <w:pStyle w:val="Heading2"/>
+      </w:pPr>
+      <w:r>
+        <w:t xml:space="preserve">5-5. Recommendations for future work</w:t>
+      </w:r>
+    </w:p>
+    <w:p>
+      <w:pPr>
+        <w:pStyle w:val="Compact"/>
+        <w:numPr>
+          <w:ilvl w:val="0"/>
+          <w:numId w:val="1004"/>
+        </w:numPr>
+      </w:pPr>
+      <w:r>
+        <w:rPr>
+          <w:b/>
+          <w:bCs/>
+        </w:rPr>
+        <w:t xml:space="preserve">Free/roller (F/R) supports:</w:t>
+      </w:r>
+      <w:r>
+        <w:t xml:space="preserve"> </w:t>
+      </w:r>
+      <w:r>
+        <w:t xml:space="preserve">a stable implementation of these supports and</w:t>
+      </w:r>
+      <w:r>
+        <w:t xml:space="preserve"> </w:t>
+      </w:r>
+      <w:r>
+        <w:t xml:space="preserve">the addition of a true plane-strain reference for a direct comparison with</w:t>
+      </w:r>
+      <w:r>
+        <w:t xml:space="preserve"> </w:t>
+      </w:r>
+      <w:r>
+        <w:t xml:space="preserve">the infinite-length limit.</w:t>
+      </w:r>
+    </w:p>
+    <w:p>
+      <w:pPr>
+        <w:pStyle w:val="Compact"/>
+        <w:numPr>
+          <w:ilvl w:val="0"/>
+          <w:numId w:val="1004"/>
+        </w:numPr>
+      </w:pPr>
+      <w:r>
+        <w:rPr>
+          <w:b/>
+          <w:bCs/>
+        </w:rPr>
+        <w:t xml:space="preserve">Vectorized assembly:</w:t>
+      </w:r>
+      <w:r>
+        <w:t xml:space="preserve"> </w:t>
+      </w:r>
+      <w:r>
+        <w:t xml:space="preserve">rewriting the assembly loop in vectorized form to</w:t>
+      </w:r>
+      <w:r>
+        <w:t xml:space="preserve"> </w:t>
+      </w:r>
+      <w:r>
+        <w:t xml:space="preserve">reduce the computation time for larger grids and broader parametric studies.</w:t>
+      </w:r>
+    </w:p>
+    <w:p>
+      <w:pPr>
+        <w:pStyle w:val="Compact"/>
+        <w:numPr>
+          <w:ilvl w:val="0"/>
+          <w:numId w:val="1004"/>
+        </w:numPr>
+      </w:pPr>
+      <w:r>
+        <w:rPr>
+          <w:b/>
+          <w:bCs/>
+        </w:rPr>
+        <w:t xml:space="preserve">Temperature-dependent material properties:</w:t>
+      </w:r>
+      <w:r>
+        <w:t xml:space="preserve"> </w:t>
+      </w:r>
+      <w:r>
+        <w:t xml:space="preserve">including the dependence of the</w:t>
+      </w:r>
+      <w:r>
+        <w:t xml:space="preserve"> </w:t>
+      </w:r>
+      <w:r>
+        <w:t xml:space="preserve">modulus, conductivity and expansion coefficient on temperature, which is</w:t>
+      </w:r>
+      <w:r>
+        <w:t xml:space="preserve"> </w:t>
+      </w:r>
+      <w:r>
+        <w:t xml:space="preserve">significant over the 300–600 K range.</w:t>
+      </w:r>
+    </w:p>
+    <w:p>
+      <w:pPr>
+        <w:pStyle w:val="Compact"/>
+        <w:numPr>
+          <w:ilvl w:val="0"/>
+          <w:numId w:val="1004"/>
+        </w:numPr>
+      </w:pPr>
+      <w:r>
+        <w:rPr>
+          <w:b/>
+          <w:bCs/>
+        </w:rPr>
+        <w:t xml:space="preserve">Radiation boundary condition:</w:t>
+      </w:r>
+      <w:r>
+        <w:t xml:space="preserve"> </w:t>
+      </w:r>
+      <w:r>
+        <w:t xml:space="preserve">adding nonlinear radiative heat exchange at</w:t>
+      </w:r>
+      <w:r>
+        <w:t xml:space="preserve"> </w:t>
+      </w:r>
+      <w:r>
+        <w:t xml:space="preserve">the outer surface for high-temperature applications.</w:t>
+      </w:r>
+    </w:p>
+    <w:p>
+      <w:pPr>
+        <w:pStyle w:val="Compact"/>
+        <w:numPr>
+          <w:ilvl w:val="0"/>
+          <w:numId w:val="1004"/>
+        </w:numPr>
+      </w:pPr>
+      <w:r>
+        <w:rPr>
+          <w:b/>
+          <w:bCs/>
+        </w:rPr>
+        <w:t xml:space="preserve">Damage/failure model:</w:t>
+      </w:r>
+      <w:r>
+        <w:t xml:space="preserve"> </w:t>
+      </w:r>
+      <w:r>
+        <w:t xml:space="preserve">since the present linear thermoelastic model shows</w:t>
+      </w:r>
+      <w:r>
+        <w:t xml:space="preserve"> </w:t>
+      </w:r>
+      <w:r>
+        <w:t xml:space="preserve">no discontinuity even at 100 MPa, adding a damage or failure model is</w:t>
+      </w:r>
+      <w:r>
+        <w:t xml:space="preserve"> </w:t>
+      </w:r>
+      <w:r>
+        <w:t xml:space="preserve">necessary to predict rupture (material failure/separation) under very high</w:t>
+      </w:r>
+      <w:r>
+        <w:t xml:space="preserve"> </w:t>
+      </w:r>
+      <w:r>
+        <w:t xml:space="preserve">loads.</w:t>
+      </w:r>
+    </w:p>
+    <w:p>
+      <w:pPr>
+        <w:pStyle w:val="Compact"/>
+        <w:numPr>
+          <w:ilvl w:val="0"/>
+          <w:numId w:val="1004"/>
+        </w:numPr>
+      </w:pPr>
+      <w:r>
+        <w:rPr>
+          <w:b/>
+          <w:bCs/>
+        </w:rPr>
+        <w:t xml:space="preserve">Updated porosity patterns:</w:t>
+      </w:r>
+      <w:r>
+        <w:t xml:space="preserve"> </w:t>
+      </w:r>
+      <w:r>
+        <w:t xml:space="preserve">replacing the porosity patterns with the new</w:t>
+      </w:r>
+      <w:r>
+        <w:t xml:space="preserve"> </w:t>
+      </w:r>
+      <w:r>
+        <w:t xml:space="preserve">patterns of the reference file and re-running the porosity and interaction</w:t>
+      </w:r>
+      <w:r>
+        <w:t xml:space="preserve"> </w:t>
+      </w:r>
+      <w:r>
+        <w:t xml:space="preserve">studies.</w:t>
+      </w:r>
+    </w:p>
+    <w:p>
+      <w:pPr>
+        <w:pStyle w:val="Compact"/>
+        <w:numPr>
+          <w:ilvl w:val="0"/>
+          <w:numId w:val="1004"/>
+        </w:numPr>
+      </w:pPr>
+      <w:r>
+        <w:rPr>
+          <w:b/>
+          <w:bCs/>
+        </w:rPr>
         <w:t xml:space="preserve">Geometric and loading extensions:</w:t>
       </w:r>
       <w:r>
@@ -1055,8 +1478,8 @@
         <w:t xml:space="preserve">three-dimensional effects.</w:t>
       </w:r>
     </w:p>
-    <w:bookmarkEnd w:id="12"/>
     <w:bookmarkEnd w:id="13"/>
+    <w:bookmarkEnd w:id="14"/>
     <w:sectPr>
       <w:footnotePr>
         <w:numRestart w:val="eachSect"/>
@@ -1421,6 +1844,36 @@
       <w:startOverride w:val="1"/>
     </w:lvlOverride>
   </w:num>
+  <w:num w:numId="1004">
+    <w:abstractNumId w:val="99411"/>
+    <w:lvlOverride w:ilvl="0">
+      <w:startOverride w:val="1"/>
+    </w:lvlOverride>
+    <w:lvlOverride w:ilvl="1">
+      <w:startOverride w:val="1"/>
+    </w:lvlOverride>
+    <w:lvlOverride w:ilvl="2">
+      <w:startOverride w:val="1"/>
+    </w:lvlOverride>
+    <w:lvlOverride w:ilvl="3">
+      <w:startOverride w:val="1"/>
+    </w:lvlOverride>
+    <w:lvlOverride w:ilvl="4">
+      <w:startOverride w:val="1"/>
+    </w:lvlOverride>
+    <w:lvlOverride w:ilvl="5">
+      <w:startOverride w:val="1"/>
+    </w:lvlOverride>
+    <w:lvlOverride w:ilvl="6">
+      <w:startOverride w:val="1"/>
+    </w:lvlOverride>
+    <w:lvlOverride w:ilvl="7">
+      <w:startOverride w:val="1"/>
+    </w:lvlOverride>
+    <w:lvlOverride w:ilvl="8">
+      <w:startOverride w:val="1"/>
+    </w:lvlOverride>
+  </w:num>
 </w:numbering>
 </file>
 
@@ -2080,7 +2533,7 @@
       <w:color w:themeColor="accent1" w:themeShade="BF" w:val="365F91"/>
     </w:rPr>
   </w:style>
-  <w:style w:type="paragraph" w:customStyle="1" w:styleId="SourceCode">
+  <w:style w:customStyle="1" w:styleId="SourceCode" w:type="paragraph">
     <w:name w:val="Source Code"/>
     <w:basedOn w:val="Normal"/>
     <w:link w:val="VerbatimChar"/>
@@ -2088,7 +2541,7 @@
       <w:wordWrap w:val="off"/>
     </w:pPr>
   </w:style>
-  <w:style w:type="character" w:customStyle="1" w:styleId="KeywordTok">
+  <w:style w:customStyle="1" w:styleId="KeywordTok" w:type="character">
     <w:name w:val="KeywordTok"/>
     <w:basedOn w:val="VerbatimChar"/>
     <w:rPr>
@@ -2096,77 +2549,77 @@
       <w:color w:val="007020"/>
     </w:rPr>
   </w:style>
-  <w:style w:type="character" w:customStyle="1" w:styleId="DataTypeTok">
+  <w:style w:customStyle="1" w:styleId="DataTypeTok" w:type="character">
     <w:name w:val="DataTypeTok"/>
     <w:basedOn w:val="VerbatimChar"/>
     <w:rPr>
       <w:color w:val="902000"/>
     </w:rPr>
   </w:style>
-  <w:style w:type="character" w:customStyle="1" w:styleId="DecValTok">
+  <w:style w:customStyle="1" w:styleId="DecValTok" w:type="character">
     <w:name w:val="DecValTok"/>
     <w:basedOn w:val="VerbatimChar"/>
     <w:rPr>
       <w:color w:val="40a070"/>
     </w:rPr>
   </w:style>
-  <w:style w:type="character" w:customStyle="1" w:styleId="BaseNTok">
+  <w:style w:customStyle="1" w:styleId="BaseNTok" w:type="character">
     <w:name w:val="BaseNTok"/>
     <w:basedOn w:val="VerbatimChar"/>
     <w:rPr>
       <w:color w:val="40a070"/>
     </w:rPr>
   </w:style>
-  <w:style w:type="character" w:customStyle="1" w:styleId="FloatTok">
+  <w:style w:customStyle="1" w:styleId="FloatTok" w:type="character">
     <w:name w:val="FloatTok"/>
     <w:basedOn w:val="VerbatimChar"/>
     <w:rPr>
       <w:color w:val="40a070"/>
     </w:rPr>
   </w:style>
-  <w:style w:type="character" w:customStyle="1" w:styleId="ConstantTok">
+  <w:style w:customStyle="1" w:styleId="ConstantTok" w:type="character">
     <w:name w:val="ConstantTok"/>
     <w:basedOn w:val="VerbatimChar"/>
     <w:rPr>
       <w:color w:val="880000"/>
     </w:rPr>
   </w:style>
-  <w:style w:type="character" w:customStyle="1" w:styleId="CharTok">
+  <w:style w:customStyle="1" w:styleId="CharTok" w:type="character">
     <w:name w:val="CharTok"/>
     <w:basedOn w:val="VerbatimChar"/>
     <w:rPr>
       <w:color w:val="4070a0"/>
     </w:rPr>
   </w:style>
-  <w:style w:type="character" w:customStyle="1" w:styleId="SpecialCharTok">
+  <w:style w:customStyle="1" w:styleId="SpecialCharTok" w:type="character">
     <w:name w:val="SpecialCharTok"/>
     <w:basedOn w:val="VerbatimChar"/>
     <w:rPr>
       <w:color w:val="4070a0"/>
     </w:rPr>
   </w:style>
-  <w:style w:type="character" w:customStyle="1" w:styleId="StringTok">
+  <w:style w:customStyle="1" w:styleId="StringTok" w:type="character">
     <w:name w:val="StringTok"/>
     <w:basedOn w:val="VerbatimChar"/>
     <w:rPr>
       <w:color w:val="4070a0"/>
     </w:rPr>
   </w:style>
-  <w:style w:type="character" w:customStyle="1" w:styleId="VerbatimStringTok">
+  <w:style w:customStyle="1" w:styleId="VerbatimStringTok" w:type="character">
     <w:name w:val="VerbatimStringTok"/>
     <w:basedOn w:val="VerbatimChar"/>
     <w:rPr>
       <w:color w:val="4070a0"/>
     </w:rPr>
   </w:style>
-  <w:style w:type="character" w:customStyle="1" w:styleId="SpecialStringTok">
+  <w:style w:customStyle="1" w:styleId="SpecialStringTok" w:type="character">
     <w:name w:val="SpecialStringTok"/>
     <w:basedOn w:val="VerbatimChar"/>
     <w:rPr>
       <w:color w:val="bb6688"/>
     </w:rPr>
   </w:style>
-  <w:style w:type="character" w:customStyle="1" w:styleId="ImportTok">
+  <w:style w:customStyle="1" w:styleId="ImportTok" w:type="character">
     <w:name w:val="ImportTok"/>
     <w:basedOn w:val="VerbatimChar"/>
     <w:rPr>
@@ -2174,7 +2627,7 @@
       <w:color w:val="008000"/>
     </w:rPr>
   </w:style>
-  <w:style w:type="character" w:customStyle="1" w:styleId="CommentTok">
+  <w:style w:customStyle="1" w:styleId="CommentTok" w:type="character">
     <w:name w:val="CommentTok"/>
     <w:basedOn w:val="VerbatimChar"/>
     <w:rPr>
@@ -2182,7 +2635,7 @@
       <w:color w:val="60a0b0"/>
     </w:rPr>
   </w:style>
-  <w:style w:type="character" w:customStyle="1" w:styleId="DocumentationTok">
+  <w:style w:customStyle="1" w:styleId="DocumentationTok" w:type="character">
     <w:name w:val="DocumentationTok"/>
     <w:basedOn w:val="VerbatimChar"/>
     <w:rPr>
@@ -2190,7 +2643,7 @@
       <w:color w:val="ba2121"/>
     </w:rPr>
   </w:style>
-  <w:style w:type="character" w:customStyle="1" w:styleId="AnnotationTok">
+  <w:style w:customStyle="1" w:styleId="AnnotationTok" w:type="character">
     <w:name w:val="AnnotationTok"/>
     <w:basedOn w:val="VerbatimChar"/>
     <w:rPr>
@@ -2199,7 +2652,7 @@
       <w:color w:val="60a0b0"/>
     </w:rPr>
   </w:style>
-  <w:style w:type="character" w:customStyle="1" w:styleId="CommentVarTok">
+  <w:style w:customStyle="1" w:styleId="CommentVarTok" w:type="character">
     <w:name w:val="CommentVarTok"/>
     <w:basedOn w:val="VerbatimChar"/>
     <w:rPr>
@@ -2208,28 +2661,28 @@
       <w:color w:val="60a0b0"/>
     </w:rPr>
   </w:style>
-  <w:style w:type="character" w:customStyle="1" w:styleId="OtherTok">
+  <w:style w:customStyle="1" w:styleId="OtherTok" w:type="character">
     <w:name w:val="OtherTok"/>
     <w:basedOn w:val="VerbatimChar"/>
     <w:rPr>
       <w:color w:val="007020"/>
     </w:rPr>
   </w:style>
-  <w:style w:type="character" w:customStyle="1" w:styleId="FunctionTok">
+  <w:style w:customStyle="1" w:styleId="FunctionTok" w:type="character">
     <w:name w:val="FunctionTok"/>
     <w:basedOn w:val="VerbatimChar"/>
     <w:rPr>
       <w:color w:val="06287e"/>
     </w:rPr>
   </w:style>
-  <w:style w:type="character" w:customStyle="1" w:styleId="VariableTok">
+  <w:style w:customStyle="1" w:styleId="VariableTok" w:type="character">
     <w:name w:val="VariableTok"/>
     <w:basedOn w:val="VerbatimChar"/>
     <w:rPr>
       <w:color w:val="19177c"/>
     </w:rPr>
   </w:style>
-  <w:style w:type="character" w:customStyle="1" w:styleId="ControlFlowTok">
+  <w:style w:customStyle="1" w:styleId="ControlFlowTok" w:type="character">
     <w:name w:val="ControlFlowTok"/>
     <w:basedOn w:val="VerbatimChar"/>
     <w:rPr>
@@ -2237,45 +2690,45 @@
       <w:color w:val="007020"/>
     </w:rPr>
   </w:style>
-  <w:style w:type="character" w:customStyle="1" w:styleId="OperatorTok">
+  <w:style w:customStyle="1" w:styleId="OperatorTok" w:type="character">
     <w:name w:val="OperatorTok"/>
     <w:basedOn w:val="VerbatimChar"/>
     <w:rPr>
       <w:color w:val="666666"/>
     </w:rPr>
   </w:style>
-  <w:style w:type="character" w:customStyle="1" w:styleId="BuiltInTok">
+  <w:style w:customStyle="1" w:styleId="BuiltInTok" w:type="character">
     <w:name w:val="BuiltInTok"/>
     <w:basedOn w:val="VerbatimChar"/>
     <w:rPr>
       <w:color w:val="008000"/>
     </w:rPr>
   </w:style>
-  <w:style w:type="character" w:customStyle="1" w:styleId="ExtensionTok">
+  <w:style w:customStyle="1" w:styleId="ExtensionTok" w:type="character">
     <w:name w:val="ExtensionTok"/>
     <w:basedOn w:val="VerbatimChar"/>
     <w:rPr/>
   </w:style>
-  <w:style w:type="character" w:customStyle="1" w:styleId="PreprocessorTok">
+  <w:style w:customStyle="1" w:styleId="PreprocessorTok" w:type="character">
     <w:name w:val="PreprocessorTok"/>
     <w:basedOn w:val="VerbatimChar"/>
     <w:rPr>
       <w:color w:val="bc7a00"/>
     </w:rPr>
   </w:style>
-  <w:style w:type="character" w:customStyle="1" w:styleId="AttributeTok">
+  <w:style w:customStyle="1" w:styleId="AttributeTok" w:type="character">
     <w:name w:val="AttributeTok"/>
     <w:basedOn w:val="VerbatimChar"/>
     <w:rPr>
       <w:color w:val="7d9029"/>
     </w:rPr>
   </w:style>
-  <w:style w:type="character" w:customStyle="1" w:styleId="RegionMarkerTok">
+  <w:style w:customStyle="1" w:styleId="RegionMarkerTok" w:type="character">
     <w:name w:val="RegionMarkerTok"/>
     <w:basedOn w:val="VerbatimChar"/>
     <w:rPr/>
   </w:style>
-  <w:style w:type="character" w:customStyle="1" w:styleId="InformationTok">
+  <w:style w:customStyle="1" w:styleId="InformationTok" w:type="character">
     <w:name w:val="InformationTok"/>
     <w:basedOn w:val="VerbatimChar"/>
     <w:rPr>
@@ -2284,7 +2737,7 @@
       <w:color w:val="60a0b0"/>
     </w:rPr>
   </w:style>
-  <w:style w:type="character" w:customStyle="1" w:styleId="WarningTok">
+  <w:style w:customStyle="1" w:styleId="WarningTok" w:type="character">
     <w:name w:val="WarningTok"/>
     <w:basedOn w:val="VerbatimChar"/>
     <w:rPr>
@@ -2293,7 +2746,7 @@
       <w:color w:val="60a0b0"/>
     </w:rPr>
   </w:style>
-  <w:style w:type="character" w:customStyle="1" w:styleId="AlertTok">
+  <w:style w:customStyle="1" w:styleId="AlertTok" w:type="character">
     <w:name w:val="AlertTok"/>
     <w:basedOn w:val="VerbatimChar"/>
     <w:rPr>
@@ -2301,7 +2754,7 @@
       <w:color w:val="ff0000"/>
     </w:rPr>
   </w:style>
-  <w:style w:type="character" w:customStyle="1" w:styleId="ErrorTok">
+  <w:style w:customStyle="1" w:styleId="ErrorTok" w:type="character">
     <w:name w:val="ErrorTok"/>
     <w:basedOn w:val="VerbatimChar"/>
     <w:rPr>
@@ -2309,7 +2762,7 @@
       <w:color w:val="ff0000"/>
     </w:rPr>
   </w:style>
-  <w:style w:type="character" w:customStyle="1" w:styleId="NormalTok">
+  <w:style w:customStyle="1" w:styleId="NormalTok" w:type="character">
     <w:name w:val="NormalTok"/>
     <w:basedOn w:val="VerbatimChar"/>
     <w:rPr/>

</xml_diff>

<commit_message>
Fix CHAPTER5_conclusions_EN.md stale pre-R4.4 numbers, match FA exactly
Section 5-2 findings and 5-3 contributions rewritten number-for-number
against chapter_stats.csv and the current FA chapter: overshoot 1.109/
1.115 (was 1.41/1.78), GPL-V -29%/3x (was -16%/5.5x), porosity-A 8x
(was 5.6x), synergy 26-fold (was nine-fold), 5x5 matrix (was 4x4),
coupling damping 1% (was 8%), clamped-support displacement -9% (was
+35%, wrong direction), Gaussian shock 2.5x (was 50x). Docx
regenerated. Closes DECISIONS_NEEDED item 10.
</commit_message>
<xml_diff>
--- a/claude/thesis_chapter/CHAPTER5_conclusions_EN.docx
+++ b/claude/thesis_chapter/CHAPTER5_conclusions_EN.docx
@@ -116,19 +116,31 @@
         <w:t xml:space="preserve"> </w:t>
       </w:r>
       <w:r>
-        <w:t xml:space="preserve">value, the Lord-Shulman theory — through the finite wave-propagation speed —</w:t>
-      </w:r>
-      <w:r>
-        <w:t xml:space="preserve"> </w:t>
-      </w:r>
-      <w:r>
-        <w:t xml:space="preserve">produces a temperature overshoot up to a dimensionless value of 1.41 in the</w:t>
-      </w:r>
-      <w:r>
-        <w:t xml:space="preserve"> </w:t>
-      </w:r>
-      <w:r>
-        <w:t xml:space="preserve">reference case and 1.78 in the thin wall. The temperature histories show the</w:t>
+        <w:t xml:space="preserve">value, the Lord-Shulman theory permits a temperature overshoot (above unity)</w:t>
+      </w:r>
+      <w:r>
+        <w:t xml:space="preserve"> </w:t>
+      </w:r>
+      <w:r>
+        <w:t xml:space="preserve">because of its finite wave-propagation speed. In the reference case the peak</w:t>
+      </w:r>
+      <w:r>
+        <w:t xml:space="preserve"> </w:t>
+      </w:r>
+      <w:r>
+        <w:t xml:space="preserve">mid-wall temperature is 0.926 and does not exceed unity, but a genuine</w:t>
+      </w:r>
+      <w:r>
+        <w:t xml:space="preserve"> </w:t>
+      </w:r>
+      <w:r>
+        <w:t xml:space="preserve">overshoot appears in cases such as porosity pattern V (1.109) and a high GPL</w:t>
+      </w:r>
+      <w:r>
+        <w:t xml:space="preserve"> </w:t>
+      </w:r>
+      <w:r>
+        <w:t xml:space="preserve">weight fraction (up to 1.115). The temperature histories show the</w:t>
       </w:r>
       <w:r>
         <w:t xml:space="preserve"> </w:t>
@@ -146,13 +158,19 @@
         <w:t xml:space="preserve"> </w:t>
       </w:r>
       <w:r>
-        <w:t xml:space="preserve">shape of the wave travelling and reflecting from</w:t>
-      </w:r>
-      <w:r>
-        <w:t xml:space="preserve"> </w:t>
-      </w:r>
-      <w:r>
-        <w:t xml:space="preserve">the outer surface, a phenomenon decisive in short-time analyses.</w:t>
+        <w:t xml:space="preserve">shape produced by the wave travelling back and</w:t>
+      </w:r>
+      <w:r>
+        <w:t xml:space="preserve"> </w:t>
+      </w:r>
+      <w:r>
+        <w:t xml:space="preserve">forth and reflecting from the outer surface, a phenomenon decisive in</w:t>
+      </w:r>
+      <w:r>
+        <w:t xml:space="preserve"> </w:t>
+      </w:r>
+      <w:r>
+        <w:t xml:space="preserve">short-time analyses.</w:t>
       </w:r>
     </w:p>
     <w:p>
@@ -185,13 +203,13 @@
         <w:t xml:space="preserve"> </w:t>
       </w:r>
       <w:r>
-        <w:t xml:space="preserve">peak temperature by about 16 % relative to the uniform case and the</w:t>
-      </w:r>
-      <w:r>
-        <w:t xml:space="preserve"> </w:t>
-      </w:r>
-      <w:r>
-        <w:t xml:space="preserve">inner-surface hoop stress by about 5.5 times. Pattern A is the mirror image</w:t>
+        <w:t xml:space="preserve">peak temperature by about 29 % relative to the uniform case and the</w:t>
+      </w:r>
+      <w:r>
+        <w:t xml:space="preserve"> </w:t>
+      </w:r>
+      <w:r>
+        <w:t xml:space="preserve">inner-surface hoop stress by about 3 times. Pattern A is the mirror image</w:t>
       </w:r>
       <w:r>
         <w:t xml:space="preserve"> </w:t>
@@ -248,7 +266,7 @@
         <w:t xml:space="preserve"> </w:t>
       </w:r>
       <w:r>
-        <w:t xml:space="preserve">outer-surface temperature by about 5.6 times, but it also reverses the sign</w:t>
+        <w:t xml:space="preserve">outer-surface temperature by about 8 times, but it also reverses the sign</w:t>
       </w:r>
       <w:r>
         <w:t xml:space="preserve"> </w:t>
@@ -260,7 +278,7 @@
         <w:t xml:space="preserve"> </w:t>
       </w:r>
       <w:r>
-        <w:t xml:space="preserve">inner surface and produces the largest transient peak of the group (1.61).</w:t>
+        <w:t xml:space="preserve">inner surface and produces the largest transient peak of the group (1.11).</w:t>
       </w:r>
     </w:p>
     <w:p>
@@ -303,19 +321,19 @@
           <w:b/>
           <w:bCs/>
         </w:rPr>
-        <w:t xml:space="preserve">nine-fold</w:t>
-      </w:r>
-      <w:r>
-        <w:t xml:space="preserve"> </w:t>
-      </w:r>
-      <w:r>
-        <w:t xml:space="preserve">at benign stress levels; this combination is the design recommendation of</w:t>
-      </w:r>
-      <w:r>
-        <w:t xml:space="preserve"> </w:t>
-      </w:r>
-      <w:r>
-        <w:t xml:space="preserve">this work for thermal-protection applications. The complete 4×4 matrix showed</w:t>
+        <w:t xml:space="preserve">26-fold</w:t>
+      </w:r>
+      <w:r>
+        <w:t xml:space="preserve"> </w:t>
+      </w:r>
+      <w:r>
+        <w:t xml:space="preserve">at a benign stress level; this combination is the design recommendation of</w:t>
+      </w:r>
+      <w:r>
+        <w:t xml:space="preserve"> </w:t>
+      </w:r>
+      <w:r>
+        <w:t xml:space="preserve">this work for thermal-protection applications. The complete 5×5 matrix showed</w:t>
       </w:r>
       <w:r>
         <w:t xml:space="preserve"> </w:t>
@@ -327,7 +345,7 @@
         <w:t xml:space="preserve"> </w:t>
       </w:r>
       <w:r>
-        <w:t xml:space="preserve">0.15) or cancelling (GPL-V with porosity-V → 1.24), so the alignment or</w:t>
+        <w:t xml:space="preserve">0.034) or cancelling (GPL-V with porosity-V → 0.692), so the alignment or</w:t>
       </w:r>
       <w:r>
         <w:t xml:space="preserve"> </w:t>
@@ -414,25 +432,31 @@
         <w:t xml:space="preserve"> </w:t>
       </w:r>
       <w:r>
-        <w:t xml:space="preserve">Of the two aspect ratios, the width-to-thickness</w:t>
-      </w:r>
-      <w:r>
-        <w:t xml:space="preserve"> </w:t>
-      </w:r>
-      <w:r>
-        <w:t xml:space="preserve">ratio is the dominant reinforcement lever (about 20 % change in stress),</w:t>
-      </w:r>
-      <w:r>
-        <w:t xml:space="preserve"> </w:t>
-      </w:r>
-      <w:r>
-        <w:t xml:space="preserve">whereas the length-to-width ratio plays a second-order role (about 3 % change</w:t>
-      </w:r>
-      <w:r>
-        <w:t xml:space="preserve"> </w:t>
-      </w:r>
-      <w:r>
-        <w:t xml:space="preserve">in temperature).</w:t>
+        <w:t xml:space="preserve">At the (low) reference weight fraction, both</w:t>
+      </w:r>
+      <w:r>
+        <w:t xml:space="preserve"> </w:t>
+      </w:r>
+      <w:r>
+        <w:t xml:space="preserve">aspect ratios have only a second-order effect, and the width-to-thickness</w:t>
+      </w:r>
+      <w:r>
+        <w:t xml:space="preserve"> </w:t>
+      </w:r>
+      <w:r>
+        <w:t xml:space="preserve">ratio is the least influential of the two (under 2 % change in stress,</w:t>
+      </w:r>
+      <w:r>
+        <w:t xml:space="preserve"> </w:t>
+      </w:r>
+      <w:r>
+        <w:t xml:space="preserve">negligible change in temperature); only at high GPL weight fractions does</w:t>
+      </w:r>
+      <w:r>
+        <w:t xml:space="preserve"> </w:t>
+      </w:r>
+      <w:r>
+        <w:t xml:space="preserve">the width-to-thickness ratio become the dominant reinforcement lever.</w:t>
       </w:r>
     </w:p>
     <w:p>
@@ -459,7 +483,7 @@
         <w:t xml:space="preserve"> </w:t>
       </w:r>
       <w:r>
-        <w:t xml:space="preserve">wave by about 8 % (thermoelastic damping); uncoupled models are</w:t>
+        <w:t xml:space="preserve">wave by about 1 % (thermoelastic damping); uncoupled models are</w:t>
       </w:r>
       <w:r>
         <w:t xml:space="preserve"> </w:t>
@@ -510,19 +534,19 @@
         <w:t xml:space="preserve"> </w:t>
       </w:r>
       <w:r>
-        <w:t xml:space="preserve">model, no discontinuity occurs up to 100 MPa. Clamped supports convert the</w:t>
-      </w:r>
-      <w:r>
-        <w:t xml:space="preserve"> </w:t>
-      </w:r>
-      <w:r>
-        <w:t xml:space="preserve">blocked axial expansion into about a 35 % increase of the radial</w:t>
-      </w:r>
-      <w:r>
-        <w:t xml:space="preserve"> </w:t>
-      </w:r>
-      <w:r>
-        <w:t xml:space="preserve">displacement; support effects are localized at the ends, and as the cylinder</w:t>
+        <w:t xml:space="preserve">model, no discontinuity occurs up to 100 MPa. Clamped supports, by blocking</w:t>
+      </w:r>
+      <w:r>
+        <w:t xml:space="preserve"> </w:t>
+      </w:r>
+      <w:r>
+        <w:t xml:space="preserve">axial expansion, reduce the peak mid-length radial displacement by about</w:t>
+      </w:r>
+      <w:r>
+        <w:t xml:space="preserve"> </w:t>
+      </w:r>
+      <w:r>
+        <w:t xml:space="preserve">9 %; support effects are localized at the ends, and as the cylinder</w:t>
       </w:r>
       <w:r>
         <w:t xml:space="preserve"> </w:t>
@@ -555,7 +579,7 @@
         <w:t xml:space="preserve"> </w:t>
       </w:r>
       <w:r>
-        <w:t xml:space="preserve">underestimates the stress response by about</w:t>
+        <w:t xml:space="preserve">underestimates the peak temperature by about</w:t>
       </w:r>
       <w:r>
         <w:t xml:space="preserve"> </w:t>
@@ -565,19 +589,19 @@
           <w:b/>
           <w:bCs/>
         </w:rPr>
-        <w:t xml:space="preserve">50 times</w:t>
-      </w:r>
-      <w:r>
-        <w:t xml:space="preserve"> </w:t>
-      </w:r>
-      <w:r>
-        <w:t xml:space="preserve">— the strongest</w:t>
-      </w:r>
-      <w:r>
-        <w:t xml:space="preserve"> </w:t>
-      </w:r>
-      <w:r>
-        <w:t xml:space="preserve">single argument of this work in favor of the generalized theory.</w:t>
+        <w:t xml:space="preserve">2.5 times</w:t>
+      </w:r>
+      <w:r>
+        <w:t xml:space="preserve"> </w:t>
+      </w:r>
+      <w:r>
+        <w:t xml:space="preserve">— one of the</w:t>
+      </w:r>
+      <w:r>
+        <w:t xml:space="preserve"> </w:t>
+      </w:r>
+      <w:r>
+        <w:t xml:space="preserve">strongest arguments of this work in favor of the generalized theory.</w:t>
       </w:r>
     </w:p>
     <w:p>
@@ -750,7 +774,7 @@
         <w:t xml:space="preserve"> </w:t>
       </w:r>
       <w:r>
-        <w:t xml:space="preserve">patterns and presentation of the complete 4×4 interaction matrix, which has no</w:t>
+        <w:t xml:space="preserve">patterns and presentation of the complete 5×5 interaction matrix, which has no</w:t>
       </w:r>
       <w:r>
         <w:t xml:space="preserve"> </w:t>

</xml_diff>